<commit_message>
docs: add author and date to the report
</commit_message>
<xml_diff>
--- a/docs/elaborat/elaborat.docx
+++ b/docs/elaborat/elaborat.docx
@@ -23,7 +23,7 @@
         <w:pStyle w:val="Author"/>
       </w:pPr>
       <w:r>
-        <w:t xml:space="preserve">[Име и презиме] — [број на индекс]</w:t>
+        <w:t xml:space="preserve">Edi Rizvani — 221598</w:t>
       </w:r>
     </w:p>
     <w:p>
@@ -31,7 +31,7 @@
         <w:pStyle w:val="Date"/>
       </w:pPr>
       <w:r>
-        <w:t xml:space="preserve">[Датум]</w:t>
+        <w:t xml:space="preserve">18.09.2026</w:t>
       </w:r>
     </w:p>
     <w:p>

</xml_diff>